<commit_message>
Adiciona payback do investimento e modelo de franquia
- Plano de negócios: seção 11.5 (payback ~11-16 meses no cenário-base) e
  seção 12.5 (modelo de franquia como via de expansão que não depende só
  de capital de investidor: taxa de franquia, royalty, fundo de marketing).
- Modelo financeiro: nova aba "Payback e Franquia" com EBITDA acumulado,
  payback interpolado (matriz e franqueado) e receita da franqueadora por
  unidade.
- Deck: 2 novos slides (payback e estrutura de franquia).
- Documento Word atualizado com as mesmas seções.

Co-Authored-By: Claude Sonnet 5 <noreply@anthropic.com>
</commit_message>
<xml_diff>
--- a/materiais-investidores/Plano_de_Negocios_Clube_Org.docx
+++ b/materiais-investidores/Plano_de_Negocios_Clube_Org.docx
@@ -6852,6 +6852,246 @@
     </w:p>
     <w:p>
       <w:pPr>
+        <w:pStyle w:val="Heading2"/>
+        <w:spacing w:after="140" w:before="280"/>
+      </w:pPr>
+      <w:r>
+        <w:t xml:space="preserve">11.5 Payback do investimento inicial</w:t>
+      </w:r>
+    </w:p>
+    <w:p>
+      <w:pPr>
+        <w:spacing w:after="160" w:line="288"/>
+      </w:pPr>
+      <w:r>
+        <w:rPr>
+          <w:rFonts w:ascii="Calibri" w:cs="Calibri" w:eastAsia="Calibri" w:hAnsi="Calibri"/>
+          <w:sz w:val="22"/>
+          <w:szCs w:val="22"/>
+        </w:rPr>
+        <w:t xml:space="preserve">Rodando o cenário-base do modelo financeiro (EBITDA mensal acumulado, ver Modelo_Financeiro.xlsx, aba "Projeção 24 Meses"), o payback do investimento inicial fica:</w:t>
+      </w:r>
+    </w:p>
+    <w:tbl>
+      <w:tblPr>
+        <w:tblW w:type="dxa" w:w="9350"/>
+        <w:tblBorders>
+          <w:top w:val="single" w:color="auto" w:sz="4"/>
+          <w:left w:val="single" w:color="auto" w:sz="4"/>
+          <w:bottom w:val="single" w:color="auto" w:sz="4"/>
+          <w:right w:val="single" w:color="auto" w:sz="4"/>
+          <w:insideH w:val="single" w:color="auto" w:sz="4"/>
+          <w:insideV w:val="single" w:color="auto" w:sz="4"/>
+        </w:tblBorders>
+      </w:tblPr>
+      <w:tblGrid>
+        <w:gridCol w:w="5610"/>
+        <w:gridCol w:w="3740"/>
+      </w:tblGrid>
+      <w:tr>
+        <w:trPr>
+          <w:cantSplit/>
+          <w:tblHeader/>
+        </w:trPr>
+        <w:tc>
+          <w:tcPr>
+            <w:tcW w:type="dxa" w:w="5610"/>
+            <w:shd w:fill="2C5F2D" w:val="clear"/>
+            <w:tcMar>
+              <w:top w:type="dxa" w:w="80"/>
+              <w:left w:type="dxa" w:w="120"/>
+              <w:bottom w:type="dxa" w:w="80"/>
+              <w:right w:type="dxa" w:w="120"/>
+            </w:tcMar>
+            <w:vAlign w:val="center"/>
+          </w:tcPr>
+          <w:p>
+            <w:pPr>
+              <w:jc w:val="left"/>
+            </w:pPr>
+            <w:r>
+              <w:rPr>
+                <w:rFonts w:ascii="Calibri" w:cs="Calibri" w:eastAsia="Calibri" w:hAnsi="Calibri"/>
+                <w:b/>
+                <w:bCs/>
+                <w:color w:val="FFFFFF"/>
+                <w:sz w:val="20"/>
+                <w:szCs w:val="20"/>
+              </w:rPr>
+              <w:t xml:space="preserve">Cenário de investimento</w:t>
+            </w:r>
+          </w:p>
+        </w:tc>
+        <w:tc>
+          <w:tcPr>
+            <w:tcW w:type="dxa" w:w="3740"/>
+            <w:shd w:fill="2C5F2D" w:val="clear"/>
+            <w:tcMar>
+              <w:top w:type="dxa" w:w="80"/>
+              <w:left w:type="dxa" w:w="120"/>
+              <w:bottom w:type="dxa" w:w="80"/>
+              <w:right w:type="dxa" w:w="120"/>
+            </w:tcMar>
+            <w:vAlign w:val="center"/>
+          </w:tcPr>
+          <w:p>
+            <w:pPr>
+              <w:jc w:val="left"/>
+            </w:pPr>
+            <w:r>
+              <w:rPr>
+                <w:rFonts w:ascii="Calibri" w:cs="Calibri" w:eastAsia="Calibri" w:hAnsi="Calibri"/>
+                <w:b/>
+                <w:bCs/>
+                <w:color w:val="FFFFFF"/>
+                <w:sz w:val="20"/>
+                <w:szCs w:val="20"/>
+              </w:rPr>
+              <w:t xml:space="preserve">Payback estimado</w:t>
+            </w:r>
+          </w:p>
+        </w:tc>
+      </w:tr>
+      <w:tr>
+        <w:trPr>
+          <w:cantSplit/>
+        </w:trPr>
+        <w:tc>
+          <w:tcPr>
+            <w:tcW w:type="dxa" w:w="5610"/>
+            <w:tcMar>
+              <w:top w:type="dxa" w:w="80"/>
+              <w:left w:type="dxa" w:w="120"/>
+              <w:bottom w:type="dxa" w:w="80"/>
+              <w:right w:type="dxa" w:w="120"/>
+            </w:tcMar>
+            <w:vAlign w:val="center"/>
+          </w:tcPr>
+          <w:p>
+            <w:pPr>
+              <w:jc w:val="left"/>
+            </w:pPr>
+            <w:r>
+              <w:rPr>
+                <w:rFonts w:ascii="Calibri" w:cs="Calibri" w:eastAsia="Calibri" w:hAnsi="Calibri"/>
+                <w:b w:val="false"/>
+                <w:bCs w:val="false"/>
+                <w:color w:val="000000"/>
+                <w:sz w:val="20"/>
+                <w:szCs w:val="20"/>
+              </w:rPr>
+              <w:t xml:space="preserve">R$ 275.000 (piso da faixa)</w:t>
+            </w:r>
+          </w:p>
+        </w:tc>
+        <w:tc>
+          <w:tcPr>
+            <w:tcW w:type="dxa" w:w="3740"/>
+            <w:tcMar>
+              <w:top w:type="dxa" w:w="80"/>
+              <w:left w:type="dxa" w:w="120"/>
+              <w:bottom w:type="dxa" w:w="80"/>
+              <w:right w:type="dxa" w:w="120"/>
+            </w:tcMar>
+            <w:vAlign w:val="center"/>
+          </w:tcPr>
+          <w:p>
+            <w:pPr>
+              <w:jc w:val="left"/>
+            </w:pPr>
+            <w:r>
+              <w:rPr>
+                <w:rFonts w:ascii="Calibri" w:cs="Calibri" w:eastAsia="Calibri" w:hAnsi="Calibri"/>
+                <w:b w:val="false"/>
+                <w:bCs w:val="false"/>
+                <w:color w:val="000000"/>
+                <w:sz w:val="20"/>
+                <w:szCs w:val="20"/>
+              </w:rPr>
+              <w:t xml:space="preserve">≈ 11 meses</w:t>
+            </w:r>
+          </w:p>
+        </w:tc>
+      </w:tr>
+      <w:tr>
+        <w:trPr>
+          <w:cantSplit/>
+        </w:trPr>
+        <w:tc>
+          <w:tcPr>
+            <w:tcW w:type="dxa" w:w="5610"/>
+            <w:shd w:fill="F2F1EA" w:val="clear"/>
+            <w:tcMar>
+              <w:top w:type="dxa" w:w="80"/>
+              <w:left w:type="dxa" w:w="120"/>
+              <w:bottom w:type="dxa" w:w="80"/>
+              <w:right w:type="dxa" w:w="120"/>
+            </w:tcMar>
+            <w:vAlign w:val="center"/>
+          </w:tcPr>
+          <w:p>
+            <w:pPr>
+              <w:jc w:val="left"/>
+            </w:pPr>
+            <w:r>
+              <w:rPr>
+                <w:rFonts w:ascii="Calibri" w:cs="Calibri" w:eastAsia="Calibri" w:hAnsi="Calibri"/>
+                <w:b w:val="false"/>
+                <w:bCs w:val="false"/>
+                <w:color w:val="000000"/>
+                <w:sz w:val="20"/>
+                <w:szCs w:val="20"/>
+              </w:rPr>
+              <w:t xml:space="preserve">R$ 580.000 (teto da faixa)</w:t>
+            </w:r>
+          </w:p>
+        </w:tc>
+        <w:tc>
+          <w:tcPr>
+            <w:tcW w:type="dxa" w:w="3740"/>
+            <w:shd w:fill="F2F1EA" w:val="clear"/>
+            <w:tcMar>
+              <w:top w:type="dxa" w:w="80"/>
+              <w:left w:type="dxa" w:w="120"/>
+              <w:bottom w:type="dxa" w:w="80"/>
+              <w:right w:type="dxa" w:w="120"/>
+            </w:tcMar>
+            <w:vAlign w:val="center"/>
+          </w:tcPr>
+          <w:p>
+            <w:pPr>
+              <w:jc w:val="left"/>
+            </w:pPr>
+            <w:r>
+              <w:rPr>
+                <w:rFonts w:ascii="Calibri" w:cs="Calibri" w:eastAsia="Calibri" w:hAnsi="Calibri"/>
+                <w:b w:val="false"/>
+                <w:bCs w:val="false"/>
+                <w:color w:val="000000"/>
+                <w:sz w:val="20"/>
+                <w:szCs w:val="20"/>
+              </w:rPr>
+              <w:t xml:space="preserve">≈ 16 meses</w:t>
+            </w:r>
+          </w:p>
+        </w:tc>
+      </w:tr>
+    </w:tbl>
+    <w:p>
+      <w:pPr>
+        <w:spacing w:after="160" w:line="288"/>
+      </w:pPr>
+      <w:r>
+        <w:rPr>
+          <w:rFonts w:ascii="Calibri" w:cs="Calibri" w:eastAsia="Calibri" w:hAnsi="Calibri"/>
+          <w:sz w:val="22"/>
+          <w:szCs w:val="22"/>
+        </w:rPr>
+        <w:t xml:space="preserve">Ressalva importante: este é o payback do cenário-base do modelo (churn 9%, CAC R$140, margem de contribuição ~30%), não um número validado com dados reais. Deve ser apresentado a investidores com essa ressalva explícita, e recalculado com os números reais assim que a Fase 0 (piloto) gerar histórico próprio.</w:t>
+      </w:r>
+    </w:p>
+    <w:p>
+      <w:pPr>
         <w:pStyle w:val="Heading1"/>
         <w:spacing w:after="200" w:before="400"/>
       </w:pPr>
@@ -7036,6 +7276,736 @@
       </w:pPr>
       <w:r>
         <w:t xml:space="preserve">B2B (fruteira de escritório) como segundo motor de crescimento no mesmo CD.</w:t>
+      </w:r>
+    </w:p>
+    <w:p>
+      <w:pPr>
+        <w:pStyle w:val="Heading2"/>
+        <w:spacing w:after="140" w:before="280"/>
+      </w:pPr>
+      <w:r>
+        <w:t xml:space="preserve">12.5 Modelo de franquia — expandir sem depender só de capital de investidor</w:t>
+      </w:r>
+    </w:p>
+    <w:p>
+      <w:pPr>
+        <w:spacing w:after="160" w:line="288"/>
+      </w:pPr>
+      <w:r>
+        <w:rPr>
+          <w:rFonts w:ascii="Calibri" w:cs="Calibri" w:eastAsia="Calibri" w:hAnsi="Calibri"/>
+          <w:sz w:val="22"/>
+          <w:szCs w:val="22"/>
+        </w:rPr>
+        <w:t xml:space="preserve">O modelo "CD-in-a-box" se presta naturalmente a franquia: a parte que exige capital pesado (CD, frota, capital de giro, relação local com fornecedores) é justamente a parte que não escala de graça — e é o tipo de investimento que um operador local pode aportar, enquanto a matriz retém a parte que não pede capital por unidade nova (marca, tecnologia, playbook, poder de negociação nacional).</w:t>
+      </w:r>
+    </w:p>
+    <w:tbl>
+      <w:tblPr>
+        <w:tblW w:type="dxa" w:w="9350"/>
+        <w:tblBorders>
+          <w:top w:val="single" w:color="auto" w:sz="4"/>
+          <w:left w:val="single" w:color="auto" w:sz="4"/>
+          <w:bottom w:val="single" w:color="auto" w:sz="4"/>
+          <w:right w:val="single" w:color="auto" w:sz="4"/>
+          <w:insideH w:val="single" w:color="auto" w:sz="4"/>
+          <w:insideV w:val="single" w:color="auto" w:sz="4"/>
+        </w:tblBorders>
+      </w:tblPr>
+      <w:tblGrid>
+        <w:gridCol w:w="1403"/>
+        <w:gridCol w:w="3740"/>
+        <w:gridCol w:w="4208"/>
+      </w:tblGrid>
+      <w:tr>
+        <w:trPr>
+          <w:cantSplit/>
+          <w:tblHeader/>
+        </w:trPr>
+        <w:tc>
+          <w:tcPr>
+            <w:tcW w:type="dxa" w:w="1403"/>
+            <w:shd w:fill="2C5F2D" w:val="clear"/>
+            <w:tcMar>
+              <w:top w:type="dxa" w:w="80"/>
+              <w:left w:type="dxa" w:w="120"/>
+              <w:bottom w:type="dxa" w:w="80"/>
+              <w:right w:type="dxa" w:w="120"/>
+            </w:tcMar>
+            <w:vAlign w:val="center"/>
+          </w:tcPr>
+          <w:p>
+            <w:pPr>
+              <w:jc w:val="left"/>
+            </w:pPr>
+            <w:r>
+              <w:rPr>
+                <w:rFonts w:ascii="Calibri" w:cs="Calibri" w:eastAsia="Calibri" w:hAnsi="Calibri"/>
+                <w:b/>
+                <w:bCs/>
+                <w:color w:val="FFFFFF"/>
+                <w:sz w:val="20"/>
+                <w:szCs w:val="20"/>
+              </w:rPr>
+              <w:t xml:space="preserve"/>
+            </w:r>
+          </w:p>
+        </w:tc>
+        <w:tc>
+          <w:tcPr>
+            <w:tcW w:type="dxa" w:w="3740"/>
+            <w:shd w:fill="2C5F2D" w:val="clear"/>
+            <w:tcMar>
+              <w:top w:type="dxa" w:w="80"/>
+              <w:left w:type="dxa" w:w="120"/>
+              <w:bottom w:type="dxa" w:w="80"/>
+              <w:right w:type="dxa" w:w="120"/>
+            </w:tcMar>
+            <w:vAlign w:val="center"/>
+          </w:tcPr>
+          <w:p>
+            <w:pPr>
+              <w:jc w:val="left"/>
+            </w:pPr>
+            <w:r>
+              <w:rPr>
+                <w:rFonts w:ascii="Calibri" w:cs="Calibri" w:eastAsia="Calibri" w:hAnsi="Calibri"/>
+                <w:b/>
+                <w:bCs/>
+                <w:color w:val="FFFFFF"/>
+                <w:sz w:val="20"/>
+                <w:szCs w:val="20"/>
+              </w:rPr>
+              <w:t xml:space="preserve">Franqueadora (matriz)</w:t>
+            </w:r>
+          </w:p>
+        </w:tc>
+        <w:tc>
+          <w:tcPr>
+            <w:tcW w:type="dxa" w:w="4208"/>
+            <w:shd w:fill="2C5F2D" w:val="clear"/>
+            <w:tcMar>
+              <w:top w:type="dxa" w:w="80"/>
+              <w:left w:type="dxa" w:w="120"/>
+              <w:bottom w:type="dxa" w:w="80"/>
+              <w:right w:type="dxa" w:w="120"/>
+            </w:tcMar>
+            <w:vAlign w:val="center"/>
+          </w:tcPr>
+          <w:p>
+            <w:pPr>
+              <w:jc w:val="left"/>
+            </w:pPr>
+            <w:r>
+              <w:rPr>
+                <w:rFonts w:ascii="Calibri" w:cs="Calibri" w:eastAsia="Calibri" w:hAnsi="Calibri"/>
+                <w:b/>
+                <w:bCs/>
+                <w:color w:val="FFFFFF"/>
+                <w:sz w:val="20"/>
+                <w:szCs w:val="20"/>
+              </w:rPr>
+              <w:t xml:space="preserve">Franqueado (operador local)</w:t>
+            </w:r>
+          </w:p>
+        </w:tc>
+      </w:tr>
+      <w:tr>
+        <w:trPr>
+          <w:cantSplit/>
+        </w:trPr>
+        <w:tc>
+          <w:tcPr>
+            <w:tcW w:type="dxa" w:w="1403"/>
+            <w:tcMar>
+              <w:top w:type="dxa" w:w="80"/>
+              <w:left w:type="dxa" w:w="120"/>
+              <w:bottom w:type="dxa" w:w="80"/>
+              <w:right w:type="dxa" w:w="120"/>
+            </w:tcMar>
+            <w:vAlign w:val="center"/>
+          </w:tcPr>
+          <w:p>
+            <w:pPr>
+              <w:jc w:val="left"/>
+            </w:pPr>
+            <w:r>
+              <w:rPr>
+                <w:rFonts w:ascii="Calibri" w:cs="Calibri" w:eastAsia="Calibri" w:hAnsi="Calibri"/>
+                <w:b w:val="false"/>
+                <w:bCs w:val="false"/>
+                <w:color w:val="000000"/>
+                <w:sz w:val="20"/>
+                <w:szCs w:val="20"/>
+              </w:rPr>
+              <w:t xml:space="preserve">Aporta</w:t>
+            </w:r>
+          </w:p>
+        </w:tc>
+        <w:tc>
+          <w:tcPr>
+            <w:tcW w:type="dxa" w:w="3740"/>
+            <w:tcMar>
+              <w:top w:type="dxa" w:w="80"/>
+              <w:left w:type="dxa" w:w="120"/>
+              <w:bottom w:type="dxa" w:w="80"/>
+              <w:right w:type="dxa" w:w="120"/>
+            </w:tcMar>
+            <w:vAlign w:val="center"/>
+          </w:tcPr>
+          <w:p>
+            <w:pPr>
+              <w:jc w:val="left"/>
+            </w:pPr>
+            <w:r>
+              <w:rPr>
+                <w:rFonts w:ascii="Calibri" w:cs="Calibri" w:eastAsia="Calibri" w:hAnsi="Calibri"/>
+                <w:b w:val="false"/>
+                <w:bCs w:val="false"/>
+                <w:color w:val="000000"/>
+                <w:sz w:val="20"/>
+                <w:szCs w:val="20"/>
+              </w:rPr>
+              <w:t xml:space="preserve">Marca, apps, site, playbook operacional, treinamento</w:t>
+            </w:r>
+          </w:p>
+        </w:tc>
+        <w:tc>
+          <w:tcPr>
+            <w:tcW w:type="dxa" w:w="4208"/>
+            <w:tcMar>
+              <w:top w:type="dxa" w:w="80"/>
+              <w:left w:type="dxa" w:w="120"/>
+              <w:bottom w:type="dxa" w:w="80"/>
+              <w:right w:type="dxa" w:w="120"/>
+            </w:tcMar>
+            <w:vAlign w:val="center"/>
+          </w:tcPr>
+          <w:p>
+            <w:pPr>
+              <w:jc w:val="left"/>
+            </w:pPr>
+            <w:r>
+              <w:rPr>
+                <w:rFonts w:ascii="Calibri" w:cs="Calibri" w:eastAsia="Calibri" w:hAnsi="Calibri"/>
+                <w:b w:val="false"/>
+                <w:bCs w:val="false"/>
+                <w:color w:val="000000"/>
+                <w:sz w:val="20"/>
+                <w:szCs w:val="20"/>
+              </w:rPr>
+              <w:t xml:space="preserve">Capital do CD local (R$275k–580k), frota, capital de giro, fornecedores em 100km, equipe</w:t>
+            </w:r>
+          </w:p>
+        </w:tc>
+      </w:tr>
+      <w:tr>
+        <w:trPr>
+          <w:cantSplit/>
+        </w:trPr>
+        <w:tc>
+          <w:tcPr>
+            <w:tcW w:type="dxa" w:w="1403"/>
+            <w:shd w:fill="F2F1EA" w:val="clear"/>
+            <w:tcMar>
+              <w:top w:type="dxa" w:w="80"/>
+              <w:left w:type="dxa" w:w="120"/>
+              <w:bottom w:type="dxa" w:w="80"/>
+              <w:right w:type="dxa" w:w="120"/>
+            </w:tcMar>
+            <w:vAlign w:val="center"/>
+          </w:tcPr>
+          <w:p>
+            <w:pPr>
+              <w:jc w:val="left"/>
+            </w:pPr>
+            <w:r>
+              <w:rPr>
+                <w:rFonts w:ascii="Calibri" w:cs="Calibri" w:eastAsia="Calibri" w:hAnsi="Calibri"/>
+                <w:b w:val="false"/>
+                <w:bCs w:val="false"/>
+                <w:color w:val="000000"/>
+                <w:sz w:val="20"/>
+                <w:szCs w:val="20"/>
+              </w:rPr>
+              <w:t xml:space="preserve">Recebe</w:t>
+            </w:r>
+          </w:p>
+        </w:tc>
+        <w:tc>
+          <w:tcPr>
+            <w:tcW w:type="dxa" w:w="3740"/>
+            <w:shd w:fill="F2F1EA" w:val="clear"/>
+            <w:tcMar>
+              <w:top w:type="dxa" w:w="80"/>
+              <w:left w:type="dxa" w:w="120"/>
+              <w:bottom w:type="dxa" w:w="80"/>
+              <w:right w:type="dxa" w:w="120"/>
+            </w:tcMar>
+            <w:vAlign w:val="center"/>
+          </w:tcPr>
+          <w:p>
+            <w:pPr>
+              <w:jc w:val="left"/>
+            </w:pPr>
+            <w:r>
+              <w:rPr>
+                <w:rFonts w:ascii="Calibri" w:cs="Calibri" w:eastAsia="Calibri" w:hAnsi="Calibri"/>
+                <w:b w:val="false"/>
+                <w:bCs w:val="false"/>
+                <w:color w:val="000000"/>
+                <w:sz w:val="20"/>
+                <w:szCs w:val="20"/>
+              </w:rPr>
+              <w:t xml:space="preserve">Taxa de franquia + royalty + fundo de marketing</w:t>
+            </w:r>
+          </w:p>
+        </w:tc>
+        <w:tc>
+          <w:tcPr>
+            <w:tcW w:type="dxa" w:w="4208"/>
+            <w:shd w:fill="F2F1EA" w:val="clear"/>
+            <w:tcMar>
+              <w:top w:type="dxa" w:w="80"/>
+              <w:left w:type="dxa" w:w="120"/>
+              <w:bottom w:type="dxa" w:w="80"/>
+              <w:right w:type="dxa" w:w="120"/>
+            </w:tcMar>
+            <w:vAlign w:val="center"/>
+          </w:tcPr>
+          <w:p>
+            <w:pPr>
+              <w:jc w:val="left"/>
+            </w:pPr>
+            <w:r>
+              <w:rPr>
+                <w:rFonts w:ascii="Calibri" w:cs="Calibri" w:eastAsia="Calibri" w:hAnsi="Calibri"/>
+                <w:b w:val="false"/>
+                <w:bCs w:val="false"/>
+                <w:color w:val="000000"/>
+                <w:sz w:val="20"/>
+                <w:szCs w:val="20"/>
+              </w:rPr>
+              <w:t xml:space="preserve">Direito de operar a marca, acesso à tecnologia pronta, suporte</w:t>
+            </w:r>
+          </w:p>
+        </w:tc>
+      </w:tr>
+    </w:tbl>
+    <w:p>
+      <w:pPr>
+        <w:pStyle w:val="Heading3"/>
+        <w:spacing w:after="100" w:before="200"/>
+      </w:pPr>
+      <w:r>
+        <w:t xml:space="preserve">Estrutura de remuneração da franqueadora</w:t>
+      </w:r>
+    </w:p>
+    <w:tbl>
+      <w:tblPr>
+        <w:tblW w:type="dxa" w:w="9350"/>
+        <w:tblBorders>
+          <w:top w:val="single" w:color="auto" w:sz="4"/>
+          <w:left w:val="single" w:color="auto" w:sz="4"/>
+          <w:bottom w:val="single" w:color="auto" w:sz="4"/>
+          <w:right w:val="single" w:color="auto" w:sz="4"/>
+          <w:insideH w:val="single" w:color="auto" w:sz="4"/>
+          <w:insideV w:val="single" w:color="auto" w:sz="4"/>
+        </w:tblBorders>
+      </w:tblPr>
+      <w:tblGrid>
+        <w:gridCol w:w="2805"/>
+        <w:gridCol w:w="2805"/>
+        <w:gridCol w:w="3740"/>
+      </w:tblGrid>
+      <w:tr>
+        <w:trPr>
+          <w:cantSplit/>
+          <w:tblHeader/>
+        </w:trPr>
+        <w:tc>
+          <w:tcPr>
+            <w:tcW w:type="dxa" w:w="2805"/>
+            <w:shd w:fill="2C5F2D" w:val="clear"/>
+            <w:tcMar>
+              <w:top w:type="dxa" w:w="80"/>
+              <w:left w:type="dxa" w:w="120"/>
+              <w:bottom w:type="dxa" w:w="80"/>
+              <w:right w:type="dxa" w:w="120"/>
+            </w:tcMar>
+            <w:vAlign w:val="center"/>
+          </w:tcPr>
+          <w:p>
+            <w:pPr>
+              <w:jc w:val="left"/>
+            </w:pPr>
+            <w:r>
+              <w:rPr>
+                <w:rFonts w:ascii="Calibri" w:cs="Calibri" w:eastAsia="Calibri" w:hAnsi="Calibri"/>
+                <w:b/>
+                <w:bCs/>
+                <w:color w:val="FFFFFF"/>
+                <w:sz w:val="20"/>
+                <w:szCs w:val="20"/>
+              </w:rPr>
+              <w:t xml:space="preserve">Componente</w:t>
+            </w:r>
+          </w:p>
+        </w:tc>
+        <w:tc>
+          <w:tcPr>
+            <w:tcW w:type="dxa" w:w="2805"/>
+            <w:shd w:fill="2C5F2D" w:val="clear"/>
+            <w:tcMar>
+              <w:top w:type="dxa" w:w="80"/>
+              <w:left w:type="dxa" w:w="120"/>
+              <w:bottom w:type="dxa" w:w="80"/>
+              <w:right w:type="dxa" w:w="120"/>
+            </w:tcMar>
+            <w:vAlign w:val="center"/>
+          </w:tcPr>
+          <w:p>
+            <w:pPr>
+              <w:jc w:val="left"/>
+            </w:pPr>
+            <w:r>
+              <w:rPr>
+                <w:rFonts w:ascii="Calibri" w:cs="Calibri" w:eastAsia="Calibri" w:hAnsi="Calibri"/>
+                <w:b/>
+                <w:bCs/>
+                <w:color w:val="FFFFFF"/>
+                <w:sz w:val="20"/>
+                <w:szCs w:val="20"/>
+              </w:rPr>
+              <w:t xml:space="preserve">Valor sugerido</w:t>
+            </w:r>
+          </w:p>
+        </w:tc>
+        <w:tc>
+          <w:tcPr>
+            <w:tcW w:type="dxa" w:w="3740"/>
+            <w:shd w:fill="2C5F2D" w:val="clear"/>
+            <w:tcMar>
+              <w:top w:type="dxa" w:w="80"/>
+              <w:left w:type="dxa" w:w="120"/>
+              <w:bottom w:type="dxa" w:w="80"/>
+              <w:right w:type="dxa" w:w="120"/>
+            </w:tcMar>
+            <w:vAlign w:val="center"/>
+          </w:tcPr>
+          <w:p>
+            <w:pPr>
+              <w:jc w:val="left"/>
+            </w:pPr>
+            <w:r>
+              <w:rPr>
+                <w:rFonts w:ascii="Calibri" w:cs="Calibri" w:eastAsia="Calibri" w:hAnsi="Calibri"/>
+                <w:b/>
+                <w:bCs/>
+                <w:color w:val="FFFFFF"/>
+                <w:sz w:val="20"/>
+                <w:szCs w:val="20"/>
+              </w:rPr>
+              <w:t xml:space="preserve">Racional</w:t>
+            </w:r>
+          </w:p>
+        </w:tc>
+      </w:tr>
+      <w:tr>
+        <w:trPr>
+          <w:cantSplit/>
+        </w:trPr>
+        <w:tc>
+          <w:tcPr>
+            <w:tcW w:type="dxa" w:w="2805"/>
+            <w:tcMar>
+              <w:top w:type="dxa" w:w="80"/>
+              <w:left w:type="dxa" w:w="120"/>
+              <w:bottom w:type="dxa" w:w="80"/>
+              <w:right w:type="dxa" w:w="120"/>
+            </w:tcMar>
+            <w:vAlign w:val="center"/>
+          </w:tcPr>
+          <w:p>
+            <w:pPr>
+              <w:jc w:val="left"/>
+            </w:pPr>
+            <w:r>
+              <w:rPr>
+                <w:rFonts w:ascii="Calibri" w:cs="Calibri" w:eastAsia="Calibri" w:hAnsi="Calibri"/>
+                <w:b w:val="false"/>
+                <w:bCs w:val="false"/>
+                <w:color w:val="000000"/>
+                <w:sz w:val="20"/>
+                <w:szCs w:val="20"/>
+              </w:rPr>
+              <w:t xml:space="preserve">Taxa de franquia inicial</w:t>
+            </w:r>
+          </w:p>
+        </w:tc>
+        <w:tc>
+          <w:tcPr>
+            <w:tcW w:type="dxa" w:w="2805"/>
+            <w:tcMar>
+              <w:top w:type="dxa" w:w="80"/>
+              <w:left w:type="dxa" w:w="120"/>
+              <w:bottom w:type="dxa" w:w="80"/>
+              <w:right w:type="dxa" w:w="120"/>
+            </w:tcMar>
+            <w:vAlign w:val="center"/>
+          </w:tcPr>
+          <w:p>
+            <w:pPr>
+              <w:jc w:val="left"/>
+            </w:pPr>
+            <w:r>
+              <w:rPr>
+                <w:rFonts w:ascii="Calibri" w:cs="Calibri" w:eastAsia="Calibri" w:hAnsi="Calibri"/>
+                <w:b w:val="false"/>
+                <w:bCs w:val="false"/>
+                <w:color w:val="000000"/>
+                <w:sz w:val="20"/>
+                <w:szCs w:val="20"/>
+              </w:rPr>
+              <w:t xml:space="preserve">R$ 40.000 – 80.000</w:t>
+            </w:r>
+          </w:p>
+        </w:tc>
+        <w:tc>
+          <w:tcPr>
+            <w:tcW w:type="dxa" w:w="3740"/>
+            <w:tcMar>
+              <w:top w:type="dxa" w:w="80"/>
+              <w:left w:type="dxa" w:w="120"/>
+              <w:bottom w:type="dxa" w:w="80"/>
+              <w:right w:type="dxa" w:w="120"/>
+            </w:tcMar>
+            <w:vAlign w:val="center"/>
+          </w:tcPr>
+          <w:p>
+            <w:pPr>
+              <w:jc w:val="left"/>
+            </w:pPr>
+            <w:r>
+              <w:rPr>
+                <w:rFonts w:ascii="Calibri" w:cs="Calibri" w:eastAsia="Calibri" w:hAnsi="Calibri"/>
+                <w:b w:val="false"/>
+                <w:bCs w:val="false"/>
+                <w:color w:val="000000"/>
+                <w:sz w:val="20"/>
+                <w:szCs w:val="20"/>
+              </w:rPr>
+              <w:t xml:space="preserve">Cobre treinamento, licença de marca e setup técnico</w:t>
+            </w:r>
+          </w:p>
+        </w:tc>
+      </w:tr>
+      <w:tr>
+        <w:trPr>
+          <w:cantSplit/>
+        </w:trPr>
+        <w:tc>
+          <w:tcPr>
+            <w:tcW w:type="dxa" w:w="2805"/>
+            <w:shd w:fill="F2F1EA" w:val="clear"/>
+            <w:tcMar>
+              <w:top w:type="dxa" w:w="80"/>
+              <w:left w:type="dxa" w:w="120"/>
+              <w:bottom w:type="dxa" w:w="80"/>
+              <w:right w:type="dxa" w:w="120"/>
+            </w:tcMar>
+            <w:vAlign w:val="center"/>
+          </w:tcPr>
+          <w:p>
+            <w:pPr>
+              <w:jc w:val="left"/>
+            </w:pPr>
+            <w:r>
+              <w:rPr>
+                <w:rFonts w:ascii="Calibri" w:cs="Calibri" w:eastAsia="Calibri" w:hAnsi="Calibri"/>
+                <w:b w:val="false"/>
+                <w:bCs w:val="false"/>
+                <w:color w:val="000000"/>
+                <w:sz w:val="20"/>
+                <w:szCs w:val="20"/>
+              </w:rPr>
+              <w:t xml:space="preserve">Royalty mensal</w:t>
+            </w:r>
+          </w:p>
+        </w:tc>
+        <w:tc>
+          <w:tcPr>
+            <w:tcW w:type="dxa" w:w="2805"/>
+            <w:shd w:fill="F2F1EA" w:val="clear"/>
+            <w:tcMar>
+              <w:top w:type="dxa" w:w="80"/>
+              <w:left w:type="dxa" w:w="120"/>
+              <w:bottom w:type="dxa" w:w="80"/>
+              <w:right w:type="dxa" w:w="120"/>
+            </w:tcMar>
+            <w:vAlign w:val="center"/>
+          </w:tcPr>
+          <w:p>
+            <w:pPr>
+              <w:jc w:val="left"/>
+            </w:pPr>
+            <w:r>
+              <w:rPr>
+                <w:rFonts w:ascii="Calibri" w:cs="Calibri" w:eastAsia="Calibri" w:hAnsi="Calibri"/>
+                <w:b w:val="false"/>
+                <w:bCs w:val="false"/>
+                <w:color w:val="000000"/>
+                <w:sz w:val="20"/>
+                <w:szCs w:val="20"/>
+              </w:rPr>
+              <w:t xml:space="preserve">5% da receita bruta</w:t>
+            </w:r>
+          </w:p>
+        </w:tc>
+        <w:tc>
+          <w:tcPr>
+            <w:tcW w:type="dxa" w:w="3740"/>
+            <w:shd w:fill="F2F1EA" w:val="clear"/>
+            <w:tcMar>
+              <w:top w:type="dxa" w:w="80"/>
+              <w:left w:type="dxa" w:w="120"/>
+              <w:bottom w:type="dxa" w:w="80"/>
+              <w:right w:type="dxa" w:w="120"/>
+            </w:tcMar>
+            <w:vAlign w:val="center"/>
+          </w:tcPr>
+          <w:p>
+            <w:pPr>
+              <w:jc w:val="left"/>
+            </w:pPr>
+            <w:r>
+              <w:rPr>
+                <w:rFonts w:ascii="Calibri" w:cs="Calibri" w:eastAsia="Calibri" w:hAnsi="Calibri"/>
+                <w:b w:val="false"/>
+                <w:bCs w:val="false"/>
+                <w:color w:val="000000"/>
+                <w:sz w:val="20"/>
+                <w:szCs w:val="20"/>
+              </w:rPr>
+              <w:t xml:space="preserve">Dentro da faixa típica de 4–8% no mercado brasileiro</w:t>
+            </w:r>
+          </w:p>
+        </w:tc>
+      </w:tr>
+      <w:tr>
+        <w:trPr>
+          <w:cantSplit/>
+        </w:trPr>
+        <w:tc>
+          <w:tcPr>
+            <w:tcW w:type="dxa" w:w="2805"/>
+            <w:tcMar>
+              <w:top w:type="dxa" w:w="80"/>
+              <w:left w:type="dxa" w:w="120"/>
+              <w:bottom w:type="dxa" w:w="80"/>
+              <w:right w:type="dxa" w:w="120"/>
+            </w:tcMar>
+            <w:vAlign w:val="center"/>
+          </w:tcPr>
+          <w:p>
+            <w:pPr>
+              <w:jc w:val="left"/>
+            </w:pPr>
+            <w:r>
+              <w:rPr>
+                <w:rFonts w:ascii="Calibri" w:cs="Calibri" w:eastAsia="Calibri" w:hAnsi="Calibri"/>
+                <w:b w:val="false"/>
+                <w:bCs w:val="false"/>
+                <w:color w:val="000000"/>
+                <w:sz w:val="20"/>
+                <w:szCs w:val="20"/>
+              </w:rPr>
+              <w:t xml:space="preserve">Fundo de marketing</w:t>
+            </w:r>
+          </w:p>
+        </w:tc>
+        <w:tc>
+          <w:tcPr>
+            <w:tcW w:type="dxa" w:w="2805"/>
+            <w:tcMar>
+              <w:top w:type="dxa" w:w="80"/>
+              <w:left w:type="dxa" w:w="120"/>
+              <w:bottom w:type="dxa" w:w="80"/>
+              <w:right w:type="dxa" w:w="120"/>
+            </w:tcMar>
+            <w:vAlign w:val="center"/>
+          </w:tcPr>
+          <w:p>
+            <w:pPr>
+              <w:jc w:val="left"/>
+            </w:pPr>
+            <w:r>
+              <w:rPr>
+                <w:rFonts w:ascii="Calibri" w:cs="Calibri" w:eastAsia="Calibri" w:hAnsi="Calibri"/>
+                <w:b w:val="false"/>
+                <w:bCs w:val="false"/>
+                <w:color w:val="000000"/>
+                <w:sz w:val="20"/>
+                <w:szCs w:val="20"/>
+              </w:rPr>
+              <w:t xml:space="preserve">1,5% da receita bruta</w:t>
+            </w:r>
+          </w:p>
+        </w:tc>
+        <w:tc>
+          <w:tcPr>
+            <w:tcW w:type="dxa" w:w="3740"/>
+            <w:tcMar>
+              <w:top w:type="dxa" w:w="80"/>
+              <w:left w:type="dxa" w:w="120"/>
+              <w:bottom w:type="dxa" w:w="80"/>
+              <w:right w:type="dxa" w:w="120"/>
+            </w:tcMar>
+            <w:vAlign w:val="center"/>
+          </w:tcPr>
+          <w:p>
+            <w:pPr>
+              <w:jc w:val="left"/>
+            </w:pPr>
+            <w:r>
+              <w:rPr>
+                <w:rFonts w:ascii="Calibri" w:cs="Calibri" w:eastAsia="Calibri" w:hAnsi="Calibri"/>
+                <w:b w:val="false"/>
+                <w:bCs w:val="false"/>
+                <w:color w:val="000000"/>
+                <w:sz w:val="20"/>
+                <w:szCs w:val="20"/>
+              </w:rPr>
+              <w:t xml:space="preserve">Campanhas de marca e evolução do app, compartilhado entre unidades</w:t>
+            </w:r>
+          </w:p>
+        </w:tc>
+      </w:tr>
+    </w:tbl>
+    <w:p>
+      <w:pPr>
+        <w:spacing w:after="160" w:line="288"/>
+      </w:pPr>
+      <w:r>
+        <w:rPr>
+          <w:rFonts w:ascii="Calibri" w:cs="Calibri" w:eastAsia="Calibri" w:hAnsi="Calibri"/>
+          <w:sz w:val="22"/>
+          <w:szCs w:val="22"/>
+        </w:rPr>
+        <w:t xml:space="preserve">Efeito no payback do franqueado: o royalty + fundo de marketing (6,5% da receita) reduz a margem de contribuição local, estendendo o payback de ~11–16 meses (matriz) para ~15–21 meses (franqueado) — cálculo completo em Modelo_Financeiro.xlsx, aba "Payback e Franquia". Ainda dentro do padrão saudável para franquias no Brasil.</w:t>
+      </w:r>
+    </w:p>
+    <w:p>
+      <w:pPr>
+        <w:spacing w:after="160" w:line="288"/>
+      </w:pPr>
+      <w:r>
+        <w:rPr>
+          <w:rFonts w:ascii="Calibri" w:cs="Calibri" w:eastAsia="Calibri" w:hAnsi="Calibri"/>
+          <w:sz w:val="22"/>
+          <w:szCs w:val="22"/>
+        </w:rPr>
+        <w:t xml:space="preserve">Encaixe no roadmap: a matriz opera e financia apenas a praça-piloto (Curitiba) para provar a unidade econômica e documentar o playbook. A partir da 2ª praça, a expansão passa a ser licenciada a operadores locais — eles capitalizam a operação regional, a matriz fatura receita recorrente (royalty) sem diluir mais capital nem concentrar o risco operacional de múltiplas cidades.</w:t>
       </w:r>
     </w:p>
     <w:p>

</xml_diff>